<commit_message>
refactor: ganti percobaan ke tahapan, daftar naratif, kesimpulan temuan, caption TNR 10
</commit_message>
<xml_diff>
--- a/Kelompok 3_Guidebook.docx
+++ b/Kelompok 3_Guidebook.docx
@@ -271,7 +271,7 @@
           <w:rFonts w:ascii="Times New Roman" w:hAnsi="Times New Roman"/>
           <w:sz w:val="24"/>
         </w:rPr>
-        <w:t>Percobaan 1: Memuat Data</w:t>
+        <w:t>Tahapan 1: Memuat Data</w:t>
       </w:r>
     </w:p>
     <w:p>
@@ -280,7 +280,7 @@
           <w:rFonts w:ascii="Times New Roman" w:hAnsi="Times New Roman"/>
           <w:sz w:val="24"/>
         </w:rPr>
-        <w:t>Percobaan 2: Ekspresi Boolean</w:t>
+        <w:t>Tahapan 2: Ekspresi Boolean</w:t>
       </w:r>
     </w:p>
     <w:p>
@@ -289,7 +289,7 @@
           <w:rFonts w:ascii="Times New Roman" w:hAnsi="Times New Roman"/>
           <w:sz w:val="24"/>
         </w:rPr>
-        <w:t>Percobaan 3: Percabangan If-Elif-Else</w:t>
+        <w:t>Tahapan 3: Percabangan If-Elif-Else</w:t>
       </w:r>
     </w:p>
     <w:p>
@@ -298,7 +298,7 @@
           <w:rFonts w:ascii="Times New Roman" w:hAnsi="Times New Roman"/>
           <w:sz w:val="24"/>
         </w:rPr>
-        <w:t>Percobaan 4: Perulangan For</w:t>
+        <w:t>Tahapan 4: Perulangan For</w:t>
       </w:r>
     </w:p>
     <w:p>
@@ -307,7 +307,7 @@
           <w:rFonts w:ascii="Times New Roman" w:hAnsi="Times New Roman"/>
           <w:sz w:val="24"/>
         </w:rPr>
-        <w:t>Percobaan 5: Perulangan While</w:t>
+        <w:t>Tahapan 5: Perulangan While</w:t>
       </w:r>
     </w:p>
     <w:p>
@@ -316,7 +316,7 @@
           <w:rFonts w:ascii="Times New Roman" w:hAnsi="Times New Roman"/>
           <w:sz w:val="24"/>
         </w:rPr>
-        <w:t>Percobaan 6: Break dan Continue</w:t>
+        <w:t>Tahapan 6: Break dan Continue</w:t>
       </w:r>
     </w:p>
     <w:p>
@@ -325,7 +325,7 @@
           <w:rFonts w:ascii="Times New Roman" w:hAnsi="Times New Roman"/>
           <w:sz w:val="24"/>
         </w:rPr>
-        <w:t>Percobaan 7: Nested Loop</w:t>
+        <w:t>Tahapan 7: Nested Loop</w:t>
       </w:r>
     </w:p>
     <w:p>
@@ -334,7 +334,7 @@
           <w:rFonts w:ascii="Times New Roman" w:hAnsi="Times New Roman"/>
           <w:sz w:val="24"/>
         </w:rPr>
-        <w:t>Percobaan 8: Comprehension</w:t>
+        <w:t>Tahapan 8: Comprehension</w:t>
       </w:r>
     </w:p>
     <w:p>
@@ -343,7 +343,7 @@
           <w:rFonts w:ascii="Times New Roman" w:hAnsi="Times New Roman"/>
           <w:sz w:val="24"/>
         </w:rPr>
-        <w:t>Percobaan 9: Menyaring Data Latih</w:t>
+        <w:t>Tahapan 9: Menyaring Data Latih</w:t>
       </w:r>
     </w:p>
     <w:p>
@@ -352,16 +352,7 @@
           <w:rFonts w:ascii="Times New Roman" w:hAnsi="Times New Roman"/>
           <w:sz w:val="24"/>
         </w:rPr>
-        <w:t>Rangkuman</w:t>
-      </w:r>
-    </w:p>
-    <w:p>
-      <w:r>
-        <w:rPr>
-          <w:rFonts w:ascii="Times New Roman" w:hAnsi="Times New Roman"/>
-          <w:sz w:val="24"/>
-        </w:rPr>
-        <w:t>Lembar Kerja</w:t>
+        <w:t>Kesimpulan</w:t>
       </w:r>
     </w:p>
     <w:p>
@@ -493,7 +484,7 @@
           <w:color w:val="000000"/>
           <w:sz w:val="24"/>
         </w:rPr>
-        <w:t>PERCOBAAN 1: MEMUAT DATA</w:t>
+        <w:t>TAHAPAN 1: MEMUAT DATA</w:t>
       </w:r>
     </w:p>
     <w:p>
@@ -537,43 +528,21 @@
           <w:color w:val="000000"/>
           <w:sz w:val="24"/>
         </w:rPr>
-        <w:t>Langkah percobaan</w:t>
+        <w:t>Alur pengerjaan</w:t>
       </w:r>
     </w:p>
     <w:p>
       <w:pPr>
-        <w:spacing w:line="360" w:lineRule="auto" w:after="60"/>
+        <w:spacing w:line="360" w:lineRule="auto" w:after="120"/>
+        <w:ind w:firstLine="567"/>
+        <w:jc w:val="both"/>
       </w:pPr>
       <w:r>
         <w:rPr>
           <w:rFonts w:ascii="Times New Roman" w:hAnsi="Times New Roman"/>
           <w:sz w:val="24"/>
         </w:rPr>
-        <w:t>1. Jalankan sel muat data di Colab.</w:t>
-      </w:r>
-    </w:p>
-    <w:p>
-      <w:pPr>
-        <w:spacing w:line="360" w:lineRule="auto" w:after="60"/>
-      </w:pPr>
-      <w:r>
-        <w:rPr>
-          <w:rFonts w:ascii="Times New Roman" w:hAnsi="Times New Roman"/>
-          <w:sz w:val="24"/>
-        </w:rPr>
-        <w:t>2. Catat jumlah baris dan kolom yang tercetak.</w:t>
-      </w:r>
-    </w:p>
-    <w:p>
-      <w:pPr>
-        <w:spacing w:line="360" w:lineRule="auto" w:after="60"/>
-      </w:pPr>
-      <w:r>
-        <w:rPr>
-          <w:rFonts w:ascii="Times New Roman" w:hAnsi="Times New Roman"/>
-          <w:sz w:val="24"/>
-        </w:rPr>
-        <w:t>3. Perhatikan tiga baris pertama yang ditampilkan.</w:t>
+        <w:t>Jalankan sel muat data di Colab. Catat jumlah baris dan kolom yang tercetak. Perhatikan tiga baris pertama yang ditampilkan.</w:t>
       </w:r>
     </w:p>
     <w:p>
@@ -685,6 +654,20 @@
     </w:p>
     <w:p>
       <w:pPr>
+        <w:spacing w:before="120" w:after="120"/>
+        <w:jc w:val="center"/>
+      </w:pPr>
+      <w:r>
+        <w:rPr>
+          <w:rFonts w:ascii="Times New Roman" w:hAnsi="Times New Roman"/>
+          <w:b/>
+          <w:sz w:val="20"/>
+        </w:rPr>
+        <w:t>Kode Program Tahapan 1</w:t>
+      </w:r>
+    </w:p>
+    <w:p>
+      <w:pPr>
         <w:pStyle w:val="Heading2"/>
         <w:spacing w:before="240" w:after="120"/>
       </w:pPr>
@@ -766,7 +749,7 @@
         <w:rPr>
           <w:rFonts w:ascii="Times New Roman" w:hAnsi="Times New Roman"/>
           <w:b/>
-          <w:sz w:val="24"/>
+          <w:sz w:val="20"/>
         </w:rPr>
         <w:t>Gambar 1. memuat data dan tiga baris pertama</w:t>
       </w:r>
@@ -832,6 +815,20 @@
     </w:p>
     <w:p>
       <w:pPr>
+        <w:spacing w:before="120" w:after="120"/>
+        <w:jc w:val="center"/>
+      </w:pPr>
+      <w:r>
+        <w:rPr>
+          <w:rFonts w:ascii="Times New Roman" w:hAnsi="Times New Roman"/>
+          <w:b/>
+          <w:sz w:val="20"/>
+        </w:rPr>
+        <w:t>Output Tahapan 1</w:t>
+      </w:r>
+    </w:p>
+    <w:p>
+      <w:pPr>
         <w:pStyle w:val="Heading2"/>
         <w:spacing w:before="240" w:after="120"/>
       </w:pPr>
@@ -877,7 +874,7 @@
           <w:color w:val="000000"/>
           <w:sz w:val="24"/>
         </w:rPr>
-        <w:t>PERCOBAAN 2: EKSPRESI BOOLEAN</w:t>
+        <w:t>TAHAPAN 2: EKSPRESI BOOLEAN</w:t>
       </w:r>
     </w:p>
     <w:p>
@@ -921,43 +918,21 @@
           <w:color w:val="000000"/>
           <w:sz w:val="24"/>
         </w:rPr>
-        <w:t>Langkah percobaan</w:t>
+        <w:t>Alur pengerjaan</w:t>
       </w:r>
     </w:p>
     <w:p>
       <w:pPr>
-        <w:spacing w:line="360" w:lineRule="auto" w:after="60"/>
+        <w:spacing w:line="360" w:lineRule="auto" w:after="120"/>
+        <w:ind w:firstLine="567"/>
+        <w:jc w:val="both"/>
       </w:pPr>
       <w:r>
         <w:rPr>
           <w:rFonts w:ascii="Times New Roman" w:hAnsi="Times New Roman"/>
           <w:sz w:val="24"/>
         </w:rPr>
-        <w:t>1. Jalankan contoh Boolean sederhana dari slide.</w:t>
-      </w:r>
-    </w:p>
-    <w:p>
-      <w:pPr>
-        <w:spacing w:line="360" w:lineRule="auto" w:after="60"/>
-      </w:pPr>
-      <w:r>
-        <w:rPr>
-          <w:rFonts w:ascii="Times New Roman" w:hAnsi="Times New Roman"/>
-          <w:sz w:val="24"/>
-        </w:rPr>
-        <w:t>2. Jalankan pemeriksaan bmi kosong, Unknown, dan BMI ekstrem.</w:t>
-      </w:r>
-    </w:p>
-    <w:p>
-      <w:pPr>
-        <w:spacing w:line="360" w:lineRule="auto" w:after="60"/>
-      </w:pPr>
-      <w:r>
-        <w:rPr>
-          <w:rFonts w:ascii="Times New Roman" w:hAnsi="Times New Roman"/>
-          <w:sz w:val="24"/>
-        </w:rPr>
-        <w:t>3. Jalankan filter gabungan lansia plus hipertensi dengan smoking diketahui.</w:t>
+        <w:t>Jalankan contoh Boolean sederhana dari slide. Jalankan pemeriksaan bmi kosong, Unknown, dan BMI ekstrem. Jalankan filter gabungan lansia plus hipertensi dengan smoking diketahui.</w:t>
       </w:r>
     </w:p>
     <w:p>
@@ -1125,6 +1100,20 @@
     </w:p>
     <w:p>
       <w:pPr>
+        <w:spacing w:before="120" w:after="120"/>
+        <w:jc w:val="center"/>
+      </w:pPr>
+      <w:r>
+        <w:rPr>
+          <w:rFonts w:ascii="Times New Roman" w:hAnsi="Times New Roman"/>
+          <w:b/>
+          <w:sz w:val="20"/>
+        </w:rPr>
+        <w:t>Kode Program Tahapan 2</w:t>
+      </w:r>
+    </w:p>
+    <w:p>
+      <w:pPr>
         <w:pStyle w:val="Heading2"/>
         <w:spacing w:before="240" w:after="120"/>
       </w:pPr>
@@ -1206,7 +1195,7 @@
         <w:rPr>
           <w:rFonts w:ascii="Times New Roman" w:hAnsi="Times New Roman"/>
           <w:b/>
-          <w:sz w:val="24"/>
+          <w:sz w:val="20"/>
         </w:rPr>
         <w:t>Gambar 2. evaluasi ekspresi Boolean pada dataset</w:t>
       </w:r>
@@ -1312,6 +1301,20 @@
     </w:p>
     <w:p>
       <w:pPr>
+        <w:spacing w:before="120" w:after="120"/>
+        <w:jc w:val="center"/>
+      </w:pPr>
+      <w:r>
+        <w:rPr>
+          <w:rFonts w:ascii="Times New Roman" w:hAnsi="Times New Roman"/>
+          <w:b/>
+          <w:sz w:val="20"/>
+        </w:rPr>
+        <w:t>Output Tahapan 2</w:t>
+      </w:r>
+    </w:p>
+    <w:p>
+      <w:pPr>
         <w:pStyle w:val="Heading2"/>
         <w:spacing w:before="240" w:after="120"/>
       </w:pPr>
@@ -1336,7 +1339,7 @@
           <w:rFonts w:ascii="Times New Roman" w:hAnsi="Times New Roman"/>
           <w:sz w:val="24"/>
         </w:rPr>
-        <w:t>Nilai "Unknown" pada smoking_status menempati sekitar 30 persen data. Itu adalah missing value tersembunyi: bukan kategori bermakna sehingga pada Percobaan 9 baris tersebut dilewati dengan continue. Baris bmi kosong hanya sekitar 4 persen dan BMI di atas 60 hanya 13 baris.</w:t>
+        <w:t>Nilai "Unknown" pada smoking_status menempati sekitar 30 persen data. Itu adalah missing value tersembunyi: bukan kategori bermakna sehingga pada Tahapan 9 baris tersebut dilewati dengan continue. Baris bmi kosong hanya sekitar 4 persen dan BMI di atas 60 hanya 13 baris.</w:t>
       </w:r>
     </w:p>
     <w:p>
@@ -1357,7 +1360,7 @@
           <w:color w:val="000000"/>
           <w:sz w:val="24"/>
         </w:rPr>
-        <w:t>PERCOBAAN 3: PERCABANGAN IF-ELIF-ELSE</w:t>
+        <w:t>TAHAPAN 3: PERCABANGAN IF-ELIF-ELSE</w:t>
       </w:r>
     </w:p>
     <w:p>
@@ -1401,43 +1404,21 @@
           <w:color w:val="000000"/>
           <w:sz w:val="24"/>
         </w:rPr>
-        <w:t>Langkah percobaan</w:t>
+        <w:t>Alur pengerjaan</w:t>
       </w:r>
     </w:p>
     <w:p>
       <w:pPr>
-        <w:spacing w:line="360" w:lineRule="auto" w:after="60"/>
+        <w:spacing w:line="360" w:lineRule="auto" w:after="120"/>
+        <w:ind w:firstLine="567"/>
+        <w:jc w:val="both"/>
       </w:pPr>
       <w:r>
         <w:rPr>
           <w:rFonts w:ascii="Times New Roman" w:hAnsi="Times New Roman"/>
           <w:sz w:val="24"/>
         </w:rPr>
-        <w:t>1. Definisikan fungsi kategori_glukosa dan kategori_risiko.</w:t>
-      </w:r>
-    </w:p>
-    <w:p>
-      <w:pPr>
-        <w:spacing w:line="360" w:lineRule="auto" w:after="60"/>
-      </w:pPr>
-      <w:r>
-        <w:rPr>
-          <w:rFonts w:ascii="Times New Roman" w:hAnsi="Times New Roman"/>
-          <w:sz w:val="24"/>
-        </w:rPr>
-        <w:t>2. Uji enam nilai batas glukosa.</w:t>
-      </w:r>
-    </w:p>
-    <w:p>
-      <w:pPr>
-        <w:spacing w:line="360" w:lineRule="auto" w:after="60"/>
-      </w:pPr>
-      <w:r>
-        <w:rPr>
-          <w:rFonts w:ascii="Times New Roman" w:hAnsi="Times New Roman"/>
-          <w:sz w:val="24"/>
-        </w:rPr>
-        <w:t>3. Terapkan kedua fungsi pada lima baris pertama dataset.</w:t>
+        <w:t>Definisikan fungsi kategori_glukosa dan kategori_risiko. Uji enam nilai batas glukosa. Terapkan kedua fungsi pada lima baris pertama dataset.</w:t>
       </w:r>
     </w:p>
     <w:p>
@@ -1677,6 +1658,20 @@
     </w:p>
     <w:p>
       <w:pPr>
+        <w:spacing w:before="120" w:after="120"/>
+        <w:jc w:val="center"/>
+      </w:pPr>
+      <w:r>
+        <w:rPr>
+          <w:rFonts w:ascii="Times New Roman" w:hAnsi="Times New Roman"/>
+          <w:b/>
+          <w:sz w:val="20"/>
+        </w:rPr>
+        <w:t>Kode Program Tahapan 3</w:t>
+      </w:r>
+    </w:p>
+    <w:p>
+      <w:pPr>
         <w:pStyle w:val="Heading2"/>
         <w:spacing w:before="240" w:after="120"/>
       </w:pPr>
@@ -1758,7 +1753,7 @@
         <w:rPr>
           <w:rFonts w:ascii="Times New Roman" w:hAnsi="Times New Roman"/>
           <w:b/>
-          <w:sz w:val="24"/>
+          <w:sz w:val="20"/>
         </w:rPr>
         <w:t>Gambar 3. uji batas kategori glukosa dan risiko lima pasien pertama</w:t>
       </w:r>
@@ -1904,6 +1899,20 @@
     </w:p>
     <w:p>
       <w:pPr>
+        <w:spacing w:before="120" w:after="120"/>
+        <w:jc w:val="center"/>
+      </w:pPr>
+      <w:r>
+        <w:rPr>
+          <w:rFonts w:ascii="Times New Roman" w:hAnsi="Times New Roman"/>
+          <w:b/>
+          <w:sz w:val="20"/>
+        </w:rPr>
+        <w:t>Output Tahapan 3</w:t>
+      </w:r>
+    </w:p>
+    <w:p>
+      <w:pPr>
         <w:pStyle w:val="Heading2"/>
         <w:spacing w:before="240" w:after="120"/>
       </w:pPr>
@@ -1949,7 +1958,7 @@
           <w:color w:val="000000"/>
           <w:sz w:val="24"/>
         </w:rPr>
-        <w:t>PERCOBAAN 4: PERULANGAN FOR</w:t>
+        <w:t>TAHAPAN 4: PERULANGAN FOR</w:t>
       </w:r>
     </w:p>
     <w:p>
@@ -1993,43 +2002,21 @@
           <w:color w:val="000000"/>
           <w:sz w:val="24"/>
         </w:rPr>
-        <w:t>Langkah percobaan</w:t>
+        <w:t>Alur pengerjaan</w:t>
       </w:r>
     </w:p>
     <w:p>
       <w:pPr>
-        <w:spacing w:line="360" w:lineRule="auto" w:after="60"/>
+        <w:spacing w:line="360" w:lineRule="auto" w:after="120"/>
+        <w:ind w:firstLine="567"/>
+        <w:jc w:val="both"/>
       </w:pPr>
       <w:r>
         <w:rPr>
           <w:rFonts w:ascii="Times New Roman" w:hAnsi="Times New Roman"/>
           <w:sz w:val="24"/>
         </w:rPr>
-        <w:t>1. Jalankan contoh enumerate dan range dari slide.</w:t>
-      </w:r>
-    </w:p>
-    <w:p>
-      <w:pPr>
-        <w:spacing w:line="360" w:lineRule="auto" w:after="60"/>
-      </w:pPr>
-      <w:r>
-        <w:rPr>
-          <w:rFonts w:ascii="Times New Roman" w:hAnsi="Times New Roman"/>
-          <w:sz w:val="24"/>
-        </w:rPr>
-        <w:t>2. Pasangkan kolom usia dan bmi lima pasien pertama dengan zip.</w:t>
-      </w:r>
-    </w:p>
-    <w:p>
-      <w:pPr>
-        <w:spacing w:line="360" w:lineRule="auto" w:after="60"/>
-      </w:pPr>
-      <w:r>
-        <w:rPr>
-          <w:rFonts w:ascii="Times New Roman" w:hAnsi="Times New Roman"/>
-          <w:sz w:val="24"/>
-        </w:rPr>
-        <w:t>3. Hitung rata-rata manual dengan for lalu adu dengan mean() pandas.</w:t>
+        <w:t>Jalankan contoh enumerate dan range dari slide. Pasangkan kolom usia dan bmi lima pasien pertama dengan zip. Hitung rata-rata manual dengan for lalu adu dengan mean() pandas.</w:t>
       </w:r>
     </w:p>
     <w:p>
@@ -2229,6 +2216,20 @@
     </w:p>
     <w:p>
       <w:pPr>
+        <w:spacing w:before="120" w:after="120"/>
+        <w:jc w:val="center"/>
+      </w:pPr>
+      <w:r>
+        <w:rPr>
+          <w:rFonts w:ascii="Times New Roman" w:hAnsi="Times New Roman"/>
+          <w:b/>
+          <w:sz w:val="20"/>
+        </w:rPr>
+        <w:t>Kode Program Tahapan 4</w:t>
+      </w:r>
+    </w:p>
+    <w:p>
+      <w:pPr>
         <w:pStyle w:val="Heading2"/>
         <w:spacing w:before="240" w:after="120"/>
       </w:pPr>
@@ -2310,7 +2311,7 @@
         <w:rPr>
           <w:rFonts w:ascii="Times New Roman" w:hAnsi="Times New Roman"/>
           <w:b/>
-          <w:sz w:val="24"/>
+          <w:sz w:val="20"/>
         </w:rPr>
         <w:t>Gambar 4. perulangan for dengan enumerate, range, dan zip</w:t>
       </w:r>
@@ -2496,6 +2497,20 @@
     </w:p>
     <w:p>
       <w:pPr>
+        <w:spacing w:before="120" w:after="120"/>
+        <w:jc w:val="center"/>
+      </w:pPr>
+      <w:r>
+        <w:rPr>
+          <w:rFonts w:ascii="Times New Roman" w:hAnsi="Times New Roman"/>
+          <w:b/>
+          <w:sz w:val="20"/>
+        </w:rPr>
+        <w:t>Output Tahapan 4</w:t>
+      </w:r>
+    </w:p>
+    <w:p>
+      <w:pPr>
         <w:pStyle w:val="Heading2"/>
         <w:spacing w:before="240" w:after="120"/>
       </w:pPr>
@@ -2541,7 +2556,7 @@
           <w:color w:val="000000"/>
           <w:sz w:val="24"/>
         </w:rPr>
-        <w:t>PERCOBAAN 5: PERULANGAN WHILE</w:t>
+        <w:t>TAHAPAN 5: PERULANGAN WHILE</w:t>
       </w:r>
     </w:p>
     <w:p>
@@ -2585,43 +2600,21 @@
           <w:color w:val="000000"/>
           <w:sz w:val="24"/>
         </w:rPr>
-        <w:t>Langkah percobaan</w:t>
+        <w:t>Alur pengerjaan</w:t>
       </w:r>
     </w:p>
     <w:p>
       <w:pPr>
-        <w:spacing w:line="360" w:lineRule="auto" w:after="60"/>
+        <w:spacing w:line="360" w:lineRule="auto" w:after="120"/>
+        <w:ind w:firstLine="567"/>
+        <w:jc w:val="both"/>
       </w:pPr>
       <w:r>
         <w:rPr>
           <w:rFonts w:ascii="Times New Roman" w:hAnsi="Times New Roman"/>
           <w:sz w:val="24"/>
         </w:rPr>
-        <w:t>1. Jalankan contoh loss menyusut dari slide.</w:t>
-      </w:r>
-    </w:p>
-    <w:p>
-      <w:pPr>
-        <w:spacing w:line="360" w:lineRule="auto" w:after="60"/>
-      </w:pPr>
-      <w:r>
-        <w:rPr>
-          <w:rFonts w:ascii="Times New Roman" w:hAnsi="Times New Roman"/>
-          <w:sz w:val="24"/>
-        </w:rPr>
-        <w:t>2. Kumpulkan lima pasien berbmi valid pertama dengan while.</w:t>
-      </w:r>
-    </w:p>
-    <w:p>
-      <w:pPr>
-        <w:spacing w:line="360" w:lineRule="auto" w:after="60"/>
-      </w:pPr>
-      <w:r>
-        <w:rPr>
-          <w:rFonts w:ascii="Times New Roman" w:hAnsi="Times New Roman"/>
-          <w:sz w:val="24"/>
-        </w:rPr>
-        <w:t>3. Periksa mengapa loop berhenti di epoch 8.</w:t>
+        <w:t>Jalankan contoh loss menyusut dari slide. Kumpulkan lima pasien berbmi valid pertama dengan while. Periksa mengapa loop berhenti di epoch 8.</w:t>
       </w:r>
     </w:p>
     <w:p>
@@ -2773,6 +2766,20 @@
     </w:p>
     <w:p>
       <w:pPr>
+        <w:spacing w:before="120" w:after="120"/>
+        <w:jc w:val="center"/>
+      </w:pPr>
+      <w:r>
+        <w:rPr>
+          <w:rFonts w:ascii="Times New Roman" w:hAnsi="Times New Roman"/>
+          <w:b/>
+          <w:sz w:val="20"/>
+        </w:rPr>
+        <w:t>Kode Program Tahapan 5</w:t>
+      </w:r>
+    </w:p>
+    <w:p>
+      <w:pPr>
         <w:pStyle w:val="Heading2"/>
         <w:spacing w:before="240" w:after="120"/>
       </w:pPr>
@@ -2854,7 +2861,7 @@
         <w:rPr>
           <w:rFonts w:ascii="Times New Roman" w:hAnsi="Times New Roman"/>
           <w:b/>
-          <w:sz w:val="24"/>
+          <w:sz w:val="20"/>
         </w:rPr>
         <w:t>Gambar 5. perulangan while epoch-loss dan pemindaian bmi valid</w:t>
       </w:r>
@@ -2984,6 +2991,20 @@
     </w:p>
     <w:p>
       <w:pPr>
+        <w:spacing w:before="120" w:after="120"/>
+        <w:jc w:val="center"/>
+      </w:pPr>
+      <w:r>
+        <w:rPr>
+          <w:rFonts w:ascii="Times New Roman" w:hAnsi="Times New Roman"/>
+          <w:b/>
+          <w:sz w:val="20"/>
+        </w:rPr>
+        <w:t>Output Tahapan 5</w:t>
+      </w:r>
+    </w:p>
+    <w:p>
+      <w:pPr>
         <w:pStyle w:val="Heading2"/>
         <w:spacing w:before="240" w:after="120"/>
       </w:pPr>
@@ -3029,7 +3050,7 @@
           <w:color w:val="000000"/>
           <w:sz w:val="24"/>
         </w:rPr>
-        <w:t>PERCOBAAN 6: BREAK DAN CONTINUE</w:t>
+        <w:t>TAHAPAN 6: BREAK DAN CONTINUE</w:t>
       </w:r>
     </w:p>
     <w:p>
@@ -3073,43 +3094,21 @@
           <w:color w:val="000000"/>
           <w:sz w:val="24"/>
         </w:rPr>
-        <w:t>Langkah percobaan</w:t>
+        <w:t>Alur pengerjaan</w:t>
       </w:r>
     </w:p>
     <w:p>
       <w:pPr>
-        <w:spacing w:line="360" w:lineRule="auto" w:after="60"/>
+        <w:spacing w:line="360" w:lineRule="auto" w:after="120"/>
+        <w:ind w:firstLine="567"/>
+        <w:jc w:val="both"/>
       </w:pPr>
       <w:r>
         <w:rPr>
           <w:rFonts w:ascii="Times New Roman" w:hAnsi="Times New Roman"/>
           <w:sz w:val="24"/>
         </w:rPr>
-        <w:t>1. Jalankan contoh slide dengan list berisi None dan negatif.</w:t>
-      </w:r>
-    </w:p>
-    <w:p>
-      <w:pPr>
-        <w:spacing w:line="360" w:lineRule="auto" w:after="60"/>
-      </w:pPr>
-      <w:r>
-        <w:rPr>
-          <w:rFonts w:ascii="Times New Roman" w:hAnsi="Times New Roman"/>
-          <w:sz w:val="24"/>
-        </w:rPr>
-        <w:t>2. Pindai 20 bmi pertama dengan aturan lewati NaN dan henti saat ekstrem.</w:t>
-      </w:r>
-    </w:p>
-    <w:p>
-      <w:pPr>
-        <w:spacing w:line="360" w:lineRule="auto" w:after="60"/>
-      </w:pPr>
-      <w:r>
-        <w:rPr>
-          <w:rFonts w:ascii="Times New Roman" w:hAnsi="Times New Roman"/>
-          <w:sz w:val="24"/>
-        </w:rPr>
-        <w:t>3. Catat cabang mana yang terpicu dan mana yang tidak.</w:t>
+        <w:t>Jalankan contoh slide dengan list berisi None dan negatif. Pindai 20 bmi pertama dengan aturan lewati NaN dan henti saat ekstrem. Catat cabang mana yang terpicu dan mana yang tidak.</w:t>
       </w:r>
     </w:p>
     <w:p>
@@ -3293,6 +3292,20 @@
     </w:p>
     <w:p>
       <w:pPr>
+        <w:spacing w:before="120" w:after="120"/>
+        <w:jc w:val="center"/>
+      </w:pPr>
+      <w:r>
+        <w:rPr>
+          <w:rFonts w:ascii="Times New Roman" w:hAnsi="Times New Roman"/>
+          <w:b/>
+          <w:sz w:val="20"/>
+        </w:rPr>
+        <w:t>Kode Program Tahapan 6</w:t>
+      </w:r>
+    </w:p>
+    <w:p>
+      <w:pPr>
         <w:pStyle w:val="Heading2"/>
         <w:spacing w:before="240" w:after="120"/>
       </w:pPr>
@@ -3374,7 +3387,7 @@
         <w:rPr>
           <w:rFonts w:ascii="Times New Roman" w:hAnsi="Times New Roman"/>
           <w:b/>
-          <w:sz w:val="24"/>
+          <w:sz w:val="20"/>
         </w:rPr>
         <w:t>Gambar 6. demonstrasi break dan continue</w:t>
       </w:r>
@@ -3456,6 +3469,20 @@
     </w:p>
     <w:p>
       <w:pPr>
+        <w:spacing w:before="120" w:after="120"/>
+        <w:jc w:val="center"/>
+      </w:pPr>
+      <w:r>
+        <w:rPr>
+          <w:rFonts w:ascii="Times New Roman" w:hAnsi="Times New Roman"/>
+          <w:b/>
+          <w:sz w:val="20"/>
+        </w:rPr>
+        <w:t>Output Tahapan 6</w:t>
+      </w:r>
+    </w:p>
+    <w:p>
+      <w:pPr>
         <w:pStyle w:val="Heading2"/>
         <w:spacing w:before="240" w:after="120"/>
       </w:pPr>
@@ -3501,7 +3528,7 @@
           <w:color w:val="000000"/>
           <w:sz w:val="24"/>
         </w:rPr>
-        <w:t>PERCOBAAN 7: NESTED LOOP</w:t>
+        <w:t>TAHAPAN 7: NESTED LOOP</w:t>
       </w:r>
     </w:p>
     <w:p>
@@ -3545,43 +3572,21 @@
           <w:color w:val="000000"/>
           <w:sz w:val="24"/>
         </w:rPr>
-        <w:t>Langkah percobaan</w:t>
+        <w:t>Alur pengerjaan</w:t>
       </w:r>
     </w:p>
     <w:p>
       <w:pPr>
-        <w:spacing w:line="360" w:lineRule="auto" w:after="60"/>
+        <w:spacing w:line="360" w:lineRule="auto" w:after="120"/>
+        <w:ind w:firstLine="567"/>
+        <w:jc w:val="both"/>
       </w:pPr>
       <w:r>
         <w:rPr>
           <w:rFonts w:ascii="Times New Roman" w:hAnsi="Times New Roman"/>
           <w:sz w:val="24"/>
         </w:rPr>
-        <w:t>1. Definisikan fungsi kelompok_usia.</w:t>
-      </w:r>
-    </w:p>
-    <w:p>
-      <w:pPr>
-        <w:spacing w:line="360" w:lineRule="auto" w:after="60"/>
-      </w:pPr>
-      <w:r>
-        <w:rPr>
-          <w:rFonts w:ascii="Times New Roman" w:hAnsi="Times New Roman"/>
-          <w:sz w:val="24"/>
-        </w:rPr>
-        <w:t>2. Jalankan nested loop 3 x 2 sel.</w:t>
-      </w:r>
-    </w:p>
-    <w:p>
-      <w:pPr>
-        <w:spacing w:line="360" w:lineRule="auto" w:after="60"/>
-      </w:pPr>
-      <w:r>
-        <w:rPr>
-          <w:rFonts w:ascii="Times New Roman" w:hAnsi="Times New Roman"/>
-          <w:sz w:val="24"/>
-        </w:rPr>
-        <w:t>3. Periksa total baris terpetakan sama dengan 5.110.</w:t>
+        <w:t>Definisikan fungsi kelompok_usia. Jalankan nested loop 3 x 2 sel. Periksa total baris terpetakan sama dengan 5.110.</w:t>
       </w:r>
     </w:p>
     <w:p>
@@ -3757,6 +3762,20 @@
     </w:p>
     <w:p>
       <w:pPr>
+        <w:spacing w:before="120" w:after="120"/>
+        <w:jc w:val="center"/>
+      </w:pPr>
+      <w:r>
+        <w:rPr>
+          <w:rFonts w:ascii="Times New Roman" w:hAnsi="Times New Roman"/>
+          <w:b/>
+          <w:sz w:val="20"/>
+        </w:rPr>
+        <w:t>Kode Program Tahapan 7</w:t>
+      </w:r>
+    </w:p>
+    <w:p>
+      <w:pPr>
         <w:pStyle w:val="Heading2"/>
         <w:spacing w:before="240" w:after="120"/>
       </w:pPr>
@@ -3838,7 +3857,7 @@
         <w:rPr>
           <w:rFonts w:ascii="Times New Roman" w:hAnsi="Times New Roman"/>
           <w:b/>
-          <w:sz w:val="24"/>
+          <w:sz w:val="20"/>
         </w:rPr>
         <w:t>Gambar 7. nested loop kelompok usia dan hipertensi</w:t>
       </w:r>
@@ -3952,6 +3971,20 @@
     </w:p>
     <w:p>
       <w:pPr>
+        <w:spacing w:before="120" w:after="120"/>
+        <w:jc w:val="center"/>
+      </w:pPr>
+      <w:r>
+        <w:rPr>
+          <w:rFonts w:ascii="Times New Roman" w:hAnsi="Times New Roman"/>
+          <w:b/>
+          <w:sz w:val="20"/>
+        </w:rPr>
+        <w:t>Output Tahapan 7</w:t>
+      </w:r>
+    </w:p>
+    <w:p>
+      <w:pPr>
         <w:pStyle w:val="Heading2"/>
         <w:spacing w:before="240" w:after="120"/>
       </w:pPr>
@@ -3988,7 +4021,7 @@
         <w:rPr>
           <w:rFonts w:ascii="Times New Roman" w:hAnsi="Times New Roman"/>
           <w:b/>
-          <w:sz w:val="24"/>
+          <w:sz w:val="20"/>
         </w:rPr>
         <w:t>Tabel 1. Proporsi stroke per kelompok usia dan hipertensi</w:t>
       </w:r>
@@ -4469,7 +4502,7 @@
           <w:color w:val="000000"/>
           <w:sz w:val="24"/>
         </w:rPr>
-        <w:t>PERCOBAAN 8: COMPREHENSION</w:t>
+        <w:t>TAHAPAN 8: COMPREHENSION</w:t>
       </w:r>
     </w:p>
     <w:p>
@@ -4513,43 +4546,21 @@
           <w:color w:val="000000"/>
           <w:sz w:val="24"/>
         </w:rPr>
-        <w:t>Langkah percobaan</w:t>
+        <w:t>Alur pengerjaan</w:t>
       </w:r>
     </w:p>
     <w:p>
       <w:pPr>
-        <w:spacing w:line="360" w:lineRule="auto" w:after="60"/>
+        <w:spacing w:line="360" w:lineRule="auto" w:after="120"/>
+        <w:ind w:firstLine="567"/>
+        <w:jc w:val="both"/>
       </w:pPr>
       <w:r>
         <w:rPr>
           <w:rFonts w:ascii="Times New Roman" w:hAnsi="Times New Roman"/>
           <w:sz w:val="24"/>
         </w:rPr>
-        <w:t>1. Jalankan contoh slide dengan list berisi None.</w:t>
-      </w:r>
-    </w:p>
-    <w:p>
-      <w:pPr>
-        <w:spacing w:line="360" w:lineRule="auto" w:after="60"/>
-      </w:pPr>
-      <w:r>
-        <w:rPr>
-          <w:rFonts w:ascii="Times New Roman" w:hAnsi="Times New Roman"/>
-          <w:sz w:val="24"/>
-        </w:rPr>
-        <w:t>2. Terapkan comprehension saring dan skala pada 10 bmi pertama.</w:t>
-      </w:r>
-    </w:p>
-    <w:p>
-      <w:pPr>
-        <w:spacing w:line="360" w:lineRule="auto" w:after="60"/>
-      </w:pPr>
-      <w:r>
-        <w:rPr>
-          <w:rFonts w:ascii="Times New Roman" w:hAnsi="Times New Roman"/>
-          <w:sz w:val="24"/>
-        </w:rPr>
-        <w:t>3. Adu hasilnya dengan dropna().</w:t>
+        <w:t>Jalankan contoh slide dengan list berisi None. Terapkan comprehension saring dan skala pada 10 bmi pertama. Adu hasilnya dengan dropna().</w:t>
       </w:r>
     </w:p>
     <w:p>
@@ -4685,6 +4696,20 @@
     </w:p>
     <w:p>
       <w:pPr>
+        <w:spacing w:before="120" w:after="120"/>
+        <w:jc w:val="center"/>
+      </w:pPr>
+      <w:r>
+        <w:rPr>
+          <w:rFonts w:ascii="Times New Roman" w:hAnsi="Times New Roman"/>
+          <w:b/>
+          <w:sz w:val="20"/>
+        </w:rPr>
+        <w:t>Kode Program Tahapan 8</w:t>
+      </w:r>
+    </w:p>
+    <w:p>
+      <w:pPr>
         <w:pStyle w:val="Heading2"/>
         <w:spacing w:before="240" w:after="120"/>
       </w:pPr>
@@ -4766,7 +4791,7 @@
         <w:rPr>
           <w:rFonts w:ascii="Times New Roman" w:hAnsi="Times New Roman"/>
           <w:b/>
-          <w:sz w:val="24"/>
+          <w:sz w:val="20"/>
         </w:rPr>
         <w:t>Gambar 8. comprehension penyaringan dan penskalaan bmi</w:t>
       </w:r>
@@ -4848,6 +4873,20 @@
     </w:p>
     <w:p>
       <w:pPr>
+        <w:spacing w:before="120" w:after="120"/>
+        <w:jc w:val="center"/>
+      </w:pPr>
+      <w:r>
+        <w:rPr>
+          <w:rFonts w:ascii="Times New Roman" w:hAnsi="Times New Roman"/>
+          <w:b/>
+          <w:sz w:val="20"/>
+        </w:rPr>
+        <w:t>Output Tahapan 8</w:t>
+      </w:r>
+    </w:p>
+    <w:p>
+      <w:pPr>
         <w:pStyle w:val="Heading2"/>
         <w:spacing w:before="240" w:after="120"/>
       </w:pPr>
@@ -4893,7 +4932,7 @@
           <w:color w:val="000000"/>
           <w:sz w:val="24"/>
         </w:rPr>
-        <w:t>PERCOBAAN 9: MENYARING DATA LATIH</w:t>
+        <w:t>TAHAPAN 9: MENYARING DATA LATIH</w:t>
       </w:r>
     </w:p>
     <w:p>
@@ -4937,43 +4976,21 @@
           <w:color w:val="000000"/>
           <w:sz w:val="24"/>
         </w:rPr>
-        <w:t>Langkah percobaan</w:t>
+        <w:t>Alur pengerjaan</w:t>
       </w:r>
     </w:p>
     <w:p>
       <w:pPr>
-        <w:spacing w:line="360" w:lineRule="auto" w:after="60"/>
+        <w:spacing w:line="360" w:lineRule="auto" w:after="120"/>
+        <w:ind w:firstLine="567"/>
+        <w:jc w:val="both"/>
       </w:pPr>
       <w:r>
         <w:rPr>
           <w:rFonts w:ascii="Times New Roman" w:hAnsi="Times New Roman"/>
           <w:sz w:val="24"/>
         </w:rPr>
-        <w:t>1. Jalankan loop penyaringan seluruh 5.110 baris.</w:t>
-      </w:r>
-    </w:p>
-    <w:p>
-      <w:pPr>
-        <w:spacing w:line="360" w:lineRule="auto" w:after="60"/>
-      </w:pPr>
-      <w:r>
-        <w:rPr>
-          <w:rFonts w:ascii="Times New Roman" w:hAnsi="Times New Roman"/>
-          <w:sz w:val="24"/>
-        </w:rPr>
-        <w:t>2. Catat jumlah valid, ditolak, dan rincian alasannya.</w:t>
-      </w:r>
-    </w:p>
-    <w:p>
-      <w:pPr>
-        <w:spacing w:line="360" w:lineRule="auto" w:after="60"/>
-      </w:pPr>
-      <w:r>
-        <w:rPr>
-          <w:rFonts w:ascii="Times New Roman" w:hAnsi="Times New Roman"/>
-          <w:sz w:val="24"/>
-        </w:rPr>
-        <w:t>3. Periksa valid plus ditolak sama dengan total baris.</w:t>
+        <w:t>Jalankan loop penyaringan seluruh 5.110 baris. Catat jumlah valid, ditolak, dan rincian alasannya. Periksa valid plus ditolak sama dengan total baris.</w:t>
       </w:r>
     </w:p>
     <w:p>
@@ -5205,6 +5222,20 @@
     </w:p>
     <w:p>
       <w:pPr>
+        <w:spacing w:before="120" w:after="120"/>
+        <w:jc w:val="center"/>
+      </w:pPr>
+      <w:r>
+        <w:rPr>
+          <w:rFonts w:ascii="Times New Roman" w:hAnsi="Times New Roman"/>
+          <w:b/>
+          <w:sz w:val="20"/>
+        </w:rPr>
+        <w:t>Kode Program Tahapan 9</w:t>
+      </w:r>
+    </w:p>
+    <w:p>
+      <w:pPr>
         <w:pStyle w:val="Heading2"/>
         <w:spacing w:before="240" w:after="120"/>
       </w:pPr>
@@ -5286,7 +5317,7 @@
         <w:rPr>
           <w:rFonts w:ascii="Times New Roman" w:hAnsi="Times New Roman"/>
           <w:b/>
-          <w:sz w:val="24"/>
+          <w:sz w:val="20"/>
         </w:rPr>
         <w:t>Gambar 9. penyaringan data latih dan rekapitulasi alasan penolakan</w:t>
       </w:r>
@@ -5360,6 +5391,20 @@
     </w:p>
     <w:p>
       <w:pPr>
+        <w:spacing w:before="120" w:after="120"/>
+        <w:jc w:val="center"/>
+      </w:pPr>
+      <w:r>
+        <w:rPr>
+          <w:rFonts w:ascii="Times New Roman" w:hAnsi="Times New Roman"/>
+          <w:b/>
+          <w:sz w:val="20"/>
+        </w:rPr>
+        <w:t>Output Tahapan 9</w:t>
+      </w:r>
+    </w:p>
+    <w:p>
+      <w:pPr>
         <w:pStyle w:val="Heading2"/>
         <w:spacing w:before="240" w:after="120"/>
       </w:pPr>
@@ -5396,7 +5441,7 @@
         <w:rPr>
           <w:rFonts w:ascii="Times New Roman" w:hAnsi="Times New Roman"/>
           <w:b/>
-          <w:sz w:val="24"/>
+          <w:sz w:val="20"/>
         </w:rPr>
         <w:t>Tabel 2. Rekapitulasi penyaringan data latih</w:t>
       </w:r>
@@ -5770,7 +5815,7 @@
           <w:color w:val="000000"/>
           <w:sz w:val="24"/>
         </w:rPr>
-        <w:t>RANGKUMAN</w:t>
+        <w:t>KESIMPULAN</w:t>
       </w:r>
     </w:p>
     <w:p>
@@ -5784,290 +5829,21 @@
           <w:rFonts w:ascii="Times New Roman" w:hAnsi="Times New Roman"/>
           <w:sz w:val="24"/>
         </w:rPr>
-        <w:t>Kontrol alur adalah fondasi pipeline data. Kondisi membuat program adaptif, loop mengotomatisasi proses berulang, dan break serta continue menangani kasus khusus. Kualitas data dimulai dari logika yang jelas.</w:t>
+        <w:t>Kesimpulan dari seluruh tahapan adalah bahwa kontrol alur merupakan fondasi dari pengolahan data. Melalui sembilan tahapan pada dataset Stroke Prediction Dataset, kami memperoleh beberapa temuan penting. Pertama, urutan pengecekan dalam percabangan sangat menentukan hasil: batas paling ketat harus diperiksa lebih dahulu karena cabang pertama yang bernilai True yang akan dieksekusi. Kedua, for dan while menjawab kebutuhan yang berbeda, yaitu menelusuri koleksi yang sudah ada berbanding berhenti saat kondisi tertentu terpenuhi. Ketiga, continue terbukti menjadi alat utama dalam penyaringan data, sedangkan break hanya tepat dipakai untuk interupsi darurat.</w:t>
       </w:r>
     </w:p>
     <w:p>
       <w:pPr>
-        <w:spacing w:before="120" w:after="120"/>
-        <w:jc w:val="center"/>
-      </w:pPr>
-      <w:r>
-        <w:rPr>
-          <w:rFonts w:ascii="Times New Roman" w:hAnsi="Times New Roman"/>
-          <w:b/>
-          <w:sz w:val="24"/>
-        </w:rPr>
-        <w:t>Tabel 3. Panduan memilih struktur kontrol alur</w:t>
-      </w:r>
-    </w:p>
-    <w:tbl>
-      <w:tblPr>
-        <w:tblStyle w:val="TableGrid"/>
-        <w:tblW w:type="auto" w:w="0"/>
-        <w:tblLayout w:type="fixed"/>
-        <w:tblLook w:firstColumn="1" w:firstRow="1" w:lastColumn="0" w:lastRow="0" w:noHBand="0" w:noVBand="1" w:val="04A0"/>
-        <w:tblLayout w:type="fixed"/>
-      </w:tblPr>
-      <w:tblGrid>
-        <w:gridCol w:w="4513"/>
-        <w:gridCol w:w="4513"/>
-      </w:tblGrid>
-      <w:tr>
-        <w:tc>
-          <w:tcPr>
-            <w:tcW w:type="dxa" w:w="4513"/>
-          </w:tcPr>
-          <w:p>
-            <w:r/>
-            <w:r>
-              <w:rPr>
-                <w:rFonts w:ascii="Times New Roman" w:hAnsi="Times New Roman"/>
-                <w:b/>
-                <w:sz w:val="24"/>
-              </w:rPr>
-              <w:t>Kebutuhan</w:t>
-            </w:r>
-          </w:p>
-        </w:tc>
-        <w:tc>
-          <w:tcPr>
-            <w:tcW w:type="dxa" w:w="4513"/>
-          </w:tcPr>
-          <w:p>
-            <w:r/>
-            <w:r>
-              <w:rPr>
-                <w:rFonts w:ascii="Times New Roman" w:hAnsi="Times New Roman"/>
-                <w:b/>
-                <w:sz w:val="24"/>
-              </w:rPr>
-              <w:t>Struktur yang dipakai</w:t>
-            </w:r>
-          </w:p>
-        </w:tc>
-      </w:tr>
-      <w:tr>
-        <w:tc>
-          <w:tcPr>
-            <w:tcW w:type="dxa" w:w="4513"/>
-          </w:tcPr>
-          <w:p>
-            <w:r/>
-            <w:r>
-              <w:rPr>
-                <w:rFonts w:ascii="Times New Roman" w:hAnsi="Times New Roman"/>
-                <w:sz w:val="24"/>
-              </w:rPr>
-              <w:t>Keputusan berlapis</w:t>
-            </w:r>
-          </w:p>
-        </w:tc>
-        <w:tc>
-          <w:tcPr>
-            <w:tcW w:type="dxa" w:w="4513"/>
-          </w:tcPr>
-          <w:p>
-            <w:r/>
-            <w:r>
-              <w:rPr>
-                <w:rFonts w:ascii="Times New Roman" w:hAnsi="Times New Roman"/>
-                <w:sz w:val="24"/>
-              </w:rPr>
-              <w:t>if-elif-else, batas ketat terlebih dahulu</w:t>
-            </w:r>
-          </w:p>
-        </w:tc>
-      </w:tr>
-      <w:tr>
-        <w:tc>
-          <w:tcPr>
-            <w:tcW w:type="dxa" w:w="4513"/>
-          </w:tcPr>
-          <w:p>
-            <w:r/>
-            <w:r>
-              <w:rPr>
-                <w:rFonts w:ascii="Times New Roman" w:hAnsi="Times New Roman"/>
-                <w:sz w:val="24"/>
-              </w:rPr>
-              <w:t>Menelusuri koleksi</w:t>
-            </w:r>
-          </w:p>
-        </w:tc>
-        <w:tc>
-          <w:tcPr>
-            <w:tcW w:type="dxa" w:w="4513"/>
-          </w:tcPr>
-          <w:p>
-            <w:r/>
-            <w:r>
-              <w:rPr>
-                <w:rFonts w:ascii="Times New Roman" w:hAnsi="Times New Roman"/>
-                <w:sz w:val="24"/>
-              </w:rPr>
-              <w:t>for dengan enumerate atau zip</w:t>
-            </w:r>
-          </w:p>
-        </w:tc>
-      </w:tr>
-      <w:tr>
-        <w:tc>
-          <w:tcPr>
-            <w:tcW w:type="dxa" w:w="4513"/>
-          </w:tcPr>
-          <w:p>
-            <w:r/>
-            <w:r>
-              <w:rPr>
-                <w:rFonts w:ascii="Times New Roman" w:hAnsi="Times New Roman"/>
-                <w:sz w:val="24"/>
-              </w:rPr>
-              <w:t>Berhenti ikut kondisi</w:t>
-            </w:r>
-          </w:p>
-        </w:tc>
-        <w:tc>
-          <w:tcPr>
-            <w:tcW w:type="dxa" w:w="4513"/>
-          </w:tcPr>
-          <w:p>
-            <w:r/>
-            <w:r>
-              <w:rPr>
-                <w:rFonts w:ascii="Times New Roman" w:hAnsi="Times New Roman"/>
-                <w:sz w:val="24"/>
-              </w:rPr>
-              <w:t>while, pengendali selalu maju</w:t>
-            </w:r>
-          </w:p>
-        </w:tc>
-      </w:tr>
-      <w:tr>
-        <w:tc>
-          <w:tcPr>
-            <w:tcW w:type="dxa" w:w="4513"/>
-          </w:tcPr>
-          <w:p>
-            <w:r/>
-            <w:r>
-              <w:rPr>
-                <w:rFonts w:ascii="Times New Roman" w:hAnsi="Times New Roman"/>
-                <w:sz w:val="24"/>
-              </w:rPr>
-              <w:t>Mengabaikan satu item</w:t>
-            </w:r>
-          </w:p>
-        </w:tc>
-        <w:tc>
-          <w:tcPr>
-            <w:tcW w:type="dxa" w:w="4513"/>
-          </w:tcPr>
-          <w:p>
-            <w:r/>
-            <w:r>
-              <w:rPr>
-                <w:rFonts w:ascii="Times New Roman" w:hAnsi="Times New Roman"/>
-                <w:sz w:val="24"/>
-              </w:rPr>
-              <w:t>continue</w:t>
-            </w:r>
-          </w:p>
-        </w:tc>
-      </w:tr>
-      <w:tr>
-        <w:tc>
-          <w:tcPr>
-            <w:tcW w:type="dxa" w:w="4513"/>
-          </w:tcPr>
-          <w:p>
-            <w:r/>
-            <w:r>
-              <w:rPr>
-                <w:rFonts w:ascii="Times New Roman" w:hAnsi="Times New Roman"/>
-                <w:sz w:val="24"/>
-              </w:rPr>
-              <w:t>Menghentikan seluruh proses</w:t>
-            </w:r>
-          </w:p>
-        </w:tc>
-        <w:tc>
-          <w:tcPr>
-            <w:tcW w:type="dxa" w:w="4513"/>
-          </w:tcPr>
-          <w:p>
-            <w:r/>
-            <w:r>
-              <w:rPr>
-                <w:rFonts w:ascii="Times New Roman" w:hAnsi="Times New Roman"/>
-                <w:sz w:val="24"/>
-              </w:rPr>
-              <w:t>break, hanya untuk keadaan darurat</w:t>
-            </w:r>
-          </w:p>
-        </w:tc>
-      </w:tr>
-    </w:tbl>
-    <w:p>
-      <w:pPr>
-        <w:spacing w:after="120"/>
-      </w:pPr>
-    </w:p>
-    <w:p>
-      <w:r>
-        <w:br w:type="page"/>
-      </w:r>
-    </w:p>
-    <w:p>
-      <w:pPr>
-        <w:pStyle w:val="Heading1"/>
-        <w:spacing w:before="240" w:after="120"/>
-        <w:jc w:val="center"/>
-      </w:pPr>
-      <w:r>
-        <w:rPr>
-          <w:rFonts w:ascii="Times New Roman" w:hAnsi="Times New Roman"/>
-          <w:b/>
-          <w:color w:val="000000"/>
-          <w:sz w:val="24"/>
-        </w:rPr>
-        <w:t>LEMBAR KERJA</w:t>
-      </w:r>
-    </w:p>
-    <w:p>
-      <w:pPr>
-        <w:spacing w:line="360" w:lineRule="auto" w:after="60"/>
+        <w:spacing w:line="360" w:lineRule="auto" w:after="120"/>
+        <w:ind w:firstLine="567"/>
+        <w:jc w:val="both"/>
       </w:pPr>
       <w:r>
         <w:rPr>
           <w:rFonts w:ascii="Times New Roman" w:hAnsi="Times New Roman"/>
           <w:sz w:val="24"/>
         </w:rPr>
-        <w:t>1. Mengapa rata-rata usia 100 baris pertama (67,28) jauh di atas rata-rata global (43,23)? Jelaskan dengan susunan dataset.</w:t>
-      </w:r>
-    </w:p>
-    <w:p>
-      <w:pPr>
-        <w:spacing w:line="360" w:lineRule="auto" w:after="60"/>
-      </w:pPr>
-      <w:r>
-        <w:rPr>
-          <w:rFonts w:ascii="Times New Roman" w:hAnsi="Times New Roman"/>
-          <w:sz w:val="24"/>
-        </w:rPr>
-        <w:t>2. Mengapa loop while pada Percobaan 5 mencetak 8 baris padahal nilai epoch 7 tercetak 0,1? Jelaskan peran pembulatan.</w:t>
-      </w:r>
-    </w:p>
-    <w:p>
-      <w:pPr>
-        <w:spacing w:line="360" w:lineRule="auto" w:after="60"/>
-      </w:pPr>
-      <w:r>
-        <w:rPr>
-          <w:rFonts w:ascii="Times New Roman" w:hAnsi="Times New Roman"/>
-          <w:sz w:val="24"/>
-        </w:rPr>
-        <w:t>3. Mengapa smoking_unknown tercatat 1.483 padahal total Unknown 1.544? Jelaskan pengaruh urutan pemeriksaan.</w:t>
+        <w:t>Temuan kuantitatif pada dataset memperkuat hal tersebut. Nilai smoking_status Unknown menempati 1.544 baris atau sekitar 30 persen data, yang merupakan missing value tersembunyi, sehingga pada penyaringan data latih baris tersebut dilewati dan tercatat 1.483 kali sebagai alasan penolakan. Baris bmi kosong hanya 201 baris atau sekitar 4 persen, dan BMI di atas 60 hanya 13 baris. Hasil penyaringan akhir menghasilkan 3.425 baris valid (67,0 persen) dan 1.685 baris ditolak (33,0 persen), dengan rincian bmi_kosong 201, smoking_unknown 1.483, dan gender_other 1. Perbandingan loop terhadap pandas pada agregasi usia 100 baris pertama menghasilkan nilai yang identik, sehingga logika perulangan yang kami tulis terbukti benar.</w:t>
       </w:r>
     </w:p>
     <w:p>

</xml_diff>